<commit_message>
Deploying to gh-pages from @ volodya-lombrozo/newsman@cfecb62d1a62b097b07ca15809429b7307857cc0 🚀
</commit_message>
<xml_diff>
--- a/2026/09/14/14.09.2026.volodya-lombrozo.gpt-5-6.docx
+++ b/2026/09/14/14.09.2026.volodya-lombrozo.gpt-5-6.docx
@@ -34,9 +34,6 @@
       </w:r>
     </w:p>
     <w:p>
-      <w:pPr>
-        <w:pStyle w:val="Heading2"/>
-      </w:pPr>
       <w:r>
         <w:rPr>
           <w:rFonts w:ascii="Times New Roman" w:hAnsi="Times New Roman" w:cs="Times New Roman"/>
@@ -47,9 +44,6 @@
       </w:r>
     </w:p>
     <w:p>
-      <w:pPr>
-        <w:pStyle w:val="Heading3"/>
-      </w:pPr>
       <w:r>
         <w:rPr>
           <w:rFonts w:ascii="Times New Roman" w:hAnsi="Times New Roman" w:cs="Times New Roman"/>
@@ -140,9 +134,6 @@
       </w:r>
     </w:p>
     <w:p>
-      <w:pPr>
-        <w:pStyle w:val="Heading2"/>
-      </w:pPr>
       <w:r>
         <w:rPr>
           <w:rFonts w:ascii="Times New Roman" w:hAnsi="Times New Roman" w:cs="Times New Roman"/>
@@ -153,9 +144,6 @@
       </w:r>
     </w:p>
     <w:p>
-      <w:pPr>
-        <w:pStyle w:val="Heading2"/>
-      </w:pPr>
       <w:r>
         <w:rPr>
           <w:rFonts w:ascii="Times New Roman" w:hAnsi="Times New Roman" w:cs="Times New Roman"/>
@@ -166,9 +154,6 @@
       </w:r>
     </w:p>
     <w:p>
-      <w:pPr>
-        <w:pStyle w:val="Heading3"/>
-      </w:pPr>
       <w:r>
         <w:rPr>
           <w:rFonts w:ascii="Times New Roman" w:hAnsi="Times New Roman" w:cs="Times New Roman"/>

</xml_diff>